<commit_message>
Sync handover docs to .NET 8; add project-intro deck
The .NET 8 retarget left the documentation referencing .NET 10. Corrected
all framework and package version references (README + four handover docs),
regenerated their .docx counterparts so cloners get the latest specs, and
added a 4-slide project-intro deck for onboarding new developers.

Co-Authored-By: Claude Opus 4.7 (1M context) <noreply@anthropic.com>
</commit_message>
<xml_diff>
--- a/README.docx
+++ b/README.docx
@@ -2,39 +2,13 @@
 <file path=word/document.xml><?xml version="1.0" encoding="utf-8"?>
 <w:document xmlns:w="http://schemas.openxmlformats.org/wordprocessingml/2006/main" xmlns:m="http://schemas.openxmlformats.org/officeDocument/2006/math" xmlns:r="http://schemas.openxmlformats.org/officeDocument/2006/relationships" xmlns:o="urn:schemas-microsoft-com:office:office" xmlns:v="urn:schemas-microsoft-com:vml" xmlns:w10="urn:schemas-microsoft-com:office:word" xmlns:a="http://schemas.openxmlformats.org/drawingml/2006/main" xmlns:pic="http://schemas.openxmlformats.org/drawingml/2006/picture" xmlns:wp="http://schemas.openxmlformats.org/drawingml/2006/wordprocessingDrawing">
   <w:body>
-    <w:sdt>
-      <w:sdtPr>
-        <w:docPartObj>
-          <w:docPartGallery w:val="Table of Contents"/>
-          <w:docPartUnique/>
-        </w:docPartObj>
-      </w:sdtPr>
-      <w:sdtContent>
-        <w:p>
-          <w:pPr>
-            <w:pStyle w:val="TOCHeading"/>
-          </w:pPr>
-          <w:r>
-            <w:t xml:space="preserve">Table of Contents</w:t>
-          </w:r>
-        </w:p>
-        <w:p>
-          <w:r>
-            <w:fldChar w:fldCharType="begin" w:dirty="true"/>
-            <w:instrText xml:space="preserve">TOC \o "1-2" \h \z \u</w:instrText>
-            <w:fldChar w:fldCharType="separate"/>
-            <w:fldChar w:fldCharType="end"/>
-          </w:r>
-        </w:p>
-      </w:sdtContent>
-    </w:sdt>
-    <w:bookmarkStart w:id="33" w:name="mcgcarewebqi-interface--net-10-rebuild"/>
+    <w:bookmarkStart w:id="33" w:name="mcgcarewebqi-interface-.net-8-rebuild"/>
     <w:p>
       <w:pPr>
         <w:pStyle w:val="Heading1"/>
       </w:pPr>
       <w:r>
-        <w:t xml:space="preserve">MCGCareWEBQI Interface — .NET 10 rebuild</w:t>
+        <w:t xml:space="preserve">MCGCareWEBQI Interface — .NET 8 rebuild</w:t>
       </w:r>
     </w:p>
     <w:p>
@@ -61,7 +35,7 @@
         <w:t xml:space="preserve"> </w:t>
       </w:r>
       <w:r>
-        <w:t xml:space="preserve">EntitySpaces; rewritten on .NET 10, ASP.NET Core (Blazor Server + minimal API),</w:t>
+        <w:t xml:space="preserve">EntitySpaces; rewritten on .NET 8, ASP.NET Core (Blazor Server + minimal API),</w:t>
       </w:r>
       <w:r>
         <w:t xml:space="preserve"> </w:t>
@@ -152,7 +126,8 @@
     <w:tbl>
       <w:tblPr>
         <w:tblStyle w:val="Table"/>
-        <w:tblW w:type="auto" w:w="0"/>
+        <w:tblW w:type="pct" w:w="5000"/>
+        <w:tblLayout w:type="fixed"/>
         <w:tblLook w:firstRow="1" w:lastRow="0" w:firstColumn="0" w:lastColumn="0" w:noHBand="0" w:noVBand="0" w:val="0020"/>
       </w:tblPr>
       <w:tblGrid>
@@ -239,7 +214,7 @@
               <w:pStyle w:val="Compact"/>
             </w:pPr>
             <w:r>
-              <w:t xml:space="preserve">EF Core 10 DbContext + entities (</w:t>
+              <w:t xml:space="preserve">EF Core 8 DbContext + entities (</w:t>
             </w:r>
             <w:r>
               <w:rPr>
@@ -1010,7 +985,7 @@
         <w:t xml:space="preserve"> </w:t>
       </w:r>
       <w:r>
-        <w:t xml:space="preserve">XML back to bridge's</w:t>
+        <w:t xml:space="preserve">XML back to bridge’s</w:t>
       </w:r>
       <w:r>
         <w:t xml:space="preserve"> </w:t>
@@ -1069,7 +1044,19 @@
         <w:t xml:space="preserve"> </w:t>
       </w:r>
       <w:r>
-        <w:t xml:space="preserve">renders a "Done" page that:</w:t>
+        <w:t xml:space="preserve">renders a</w:t>
+      </w:r>
+      <w:r>
+        <w:t xml:space="preserve"> </w:t>
+      </w:r>
+      <w:r>
+        <w:t xml:space="preserve">“Done”</w:t>
+      </w:r>
+      <w:r>
+        <w:t xml:space="preserve"> </w:t>
+      </w:r>
+      <w:r>
+        <w:t xml:space="preserve">page that:</w:t>
       </w:r>
     </w:p>
     <w:p>
@@ -1114,7 +1101,7 @@
         </w:numPr>
       </w:pPr>
       <w:r>
-        <w:t xml:space="preserve">(in parallel) POSTs result JSON to caller's</w:t>
+        <w:t xml:space="preserve">(in parallel) POSTs result JSON to caller’s</w:t>
       </w:r>
       <w:r>
         <w:t xml:space="preserve"> </w:t>
@@ -1285,7 +1272,7 @@
         <w:t xml:space="preserve"> </w:t>
       </w:r>
       <w:r>
-        <w:t xml:space="preserve">the CareWebQI 12.0 Developer's Guide.</w:t>
+        <w:t xml:space="preserve">the CareWebQI 12.0 Developer’s Guide.</w:t>
       </w:r>
     </w:p>
     <w:bookmarkEnd w:id="17"/>
@@ -1310,7 +1297,8 @@
     <w:tbl>
       <w:tblPr>
         <w:tblStyle w:val="Table"/>
-        <w:tblW w:type="auto" w:w="0"/>
+        <w:tblW w:type="pct" w:w="5000"/>
+        <w:tblLayout w:type="fixed"/>
         <w:tblLook w:firstRow="1" w:lastRow="0" w:firstColumn="0" w:lastColumn="0" w:noHBand="0" w:noVBand="0" w:val="0020"/>
       </w:tblPr>
       <w:tblGrid>
@@ -1538,7 +1526,8 @@
     <w:tbl>
       <w:tblPr>
         <w:tblStyle w:val="Table"/>
-        <w:tblW w:type="auto" w:w="0"/>
+        <w:tblW w:type="pct" w:w="5000"/>
+        <w:tblLayout w:type="fixed"/>
         <w:tblLook w:firstRow="1" w:lastRow="0" w:firstColumn="0" w:lastColumn="0" w:noHBand="0" w:noVBand="0" w:val="0020"/>
       </w:tblPr>
       <w:tblGrid>
@@ -1726,7 +1715,7 @@
         <w:pStyle w:val="Heading2"/>
       </w:pPr>
       <w:r>
-        <w:t xml:space="preserve">What's intentionally NOT here</w:t>
+        <w:t xml:space="preserve">What’s intentionally NOT here</w:t>
       </w:r>
     </w:p>
     <w:p>
@@ -1754,13 +1743,13 @@
         <w:t xml:space="preserve"> </w:t>
       </w:r>
       <w:r>
-        <w:t xml:space="preserve">EntitySpaces-based DLLs from the prior host application. The new design doesn't</w:t>
-      </w:r>
-      <w:r>
-        <w:t xml:space="preserve"> </w:t>
-      </w:r>
-      <w:r>
-        <w:t xml:space="preserve">write into any caller's tables — it owns its own</w:t>
+        <w:t xml:space="preserve">EntitySpaces-based DLLs from the prior host application. The new design doesn’t</w:t>
+      </w:r>
+      <w:r>
+        <w:t xml:space="preserve"> </w:t>
+      </w:r>
+      <w:r>
+        <w:t xml:space="preserve">write into any caller’s tables — it owns its own</w:t>
       </w:r>
       <w:r>
         <w:t xml:space="preserve"> </w:t>
@@ -1797,7 +1786,7 @@
         <w:t xml:space="preserve"> </w:t>
       </w:r>
       <w:r>
-        <w:t xml:space="preserve">Replaced with EF Core 10 / LINQ.</w:t>
+        <w:t xml:space="preserve">Replaced with EF Core 8 / LINQ.</w:t>
       </w:r>
     </w:p>
     <w:p>
@@ -1869,13 +1858,37 @@
         </w:numPr>
       </w:pPr>
       <w:r>
-        <w:t xml:space="preserve">.NET 10 (</w:t>
+        <w:t xml:space="preserve">.NET 8 (</w:t>
       </w:r>
       <w:r>
         <w:rPr>
           <w:rStyle w:val="VerbatimChar"/>
         </w:rPr>
-        <w:t xml:space="preserve">net10.0</w:t>
+        <w:t xml:space="preserve">net8.0</w:t>
+      </w:r>
+      <w:r>
+        <w:t xml:space="preserve">) — SDK pinned via</w:t>
+      </w:r>
+      <w:r>
+        <w:t xml:space="preserve"> </w:t>
+      </w:r>
+      <w:r>
+        <w:rPr>
+          <w:rStyle w:val="VerbatimChar"/>
+        </w:rPr>
+        <w:t xml:space="preserve">global.json</w:t>
+      </w:r>
+      <w:r>
+        <w:t xml:space="preserve"> </w:t>
+      </w:r>
+      <w:r>
+        <w:t xml:space="preserve">(</w:t>
+      </w:r>
+      <w:r>
+        <w:rPr>
+          <w:rStyle w:val="VerbatimChar"/>
+        </w:rPr>
+        <w:t xml:space="preserve">rollForward: latestFeature</w:t>
       </w:r>
       <w:r>
         <w:t xml:space="preserve">)</w:t>
@@ -1890,7 +1903,7 @@
         </w:numPr>
       </w:pPr>
       <w:r>
-        <w:t xml:space="preserve">ASP.NET Core 10, Blazor Server (interactive)</w:t>
+        <w:t xml:space="preserve">ASP.NET Core 8, Blazor Server (interactive)</w:t>
       </w:r>
     </w:p>
     <w:p>
@@ -1902,7 +1915,7 @@
         </w:numPr>
       </w:pPr>
       <w:r>
-        <w:t xml:space="preserve">Entity Framework Core 10 + SQL Server (LocalDB for dev)</w:t>
+        <w:t xml:space="preserve">Entity Framework Core 8 + SQL Server (LocalDB for dev)</w:t>
       </w:r>
     </w:p>
     <w:p>
@@ -1935,7 +1948,7 @@
         </w:numPr>
       </w:pPr>
       <w:r>
-        <w:t xml:space="preserve">MudBlazor 9.4 for UI components (Material 3)</w:t>
+        <w:t xml:space="preserve">MudBlazor 8.0 for UI components</w:t>
       </w:r>
     </w:p>
     <w:p>
@@ -2981,7 +2994,6 @@
     <w:link w:val="VerbatimChar"/>
     <w:pPr>
       <w:wordWrap w:val="off"/>
-      <w:shd w:val="clear" w:fill="f8f8f8"/>
     </w:pPr>
   </w:style>
   <w:style w:type="character" w:customStyle="1" w:styleId="KeywordTok">
@@ -2989,96 +3001,85 @@
     <w:basedOn w:val="VerbatimChar"/>
     <w:rPr>
       <w:b/>
-      <w:color w:val="204a87"/>
-      <w:shd w:val="clear" w:fill="f8f8f8"/>
+      <w:color w:val="007020"/>
     </w:rPr>
   </w:style>
   <w:style w:type="character" w:customStyle="1" w:styleId="DataTypeTok">
     <w:name w:val="DataTypeTok"/>
     <w:basedOn w:val="VerbatimChar"/>
     <w:rPr>
-      <w:color w:val="204a87"/>
-      <w:shd w:val="clear" w:fill="f8f8f8"/>
+      <w:color w:val="902000"/>
     </w:rPr>
   </w:style>
   <w:style w:type="character" w:customStyle="1" w:styleId="DecValTok">
     <w:name w:val="DecValTok"/>
     <w:basedOn w:val="VerbatimChar"/>
     <w:rPr>
-      <w:color w:val="0000cf"/>
-      <w:shd w:val="clear" w:fill="f8f8f8"/>
+      <w:color w:val="40a070"/>
     </w:rPr>
   </w:style>
   <w:style w:type="character" w:customStyle="1" w:styleId="BaseNTok">
     <w:name w:val="BaseNTok"/>
     <w:basedOn w:val="VerbatimChar"/>
     <w:rPr>
-      <w:color w:val="0000cf"/>
-      <w:shd w:val="clear" w:fill="f8f8f8"/>
+      <w:color w:val="40a070"/>
     </w:rPr>
   </w:style>
   <w:style w:type="character" w:customStyle="1" w:styleId="FloatTok">
     <w:name w:val="FloatTok"/>
     <w:basedOn w:val="VerbatimChar"/>
     <w:rPr>
-      <w:color w:val="0000cf"/>
-      <w:shd w:val="clear" w:fill="f8f8f8"/>
+      <w:color w:val="40a070"/>
     </w:rPr>
   </w:style>
   <w:style w:type="character" w:customStyle="1" w:styleId="ConstantTok">
     <w:name w:val="ConstantTok"/>
     <w:basedOn w:val="VerbatimChar"/>
     <w:rPr>
-      <w:color w:val="8f5902"/>
-      <w:shd w:val="clear" w:fill="f8f8f8"/>
+      <w:color w:val="880000"/>
     </w:rPr>
   </w:style>
   <w:style w:type="character" w:customStyle="1" w:styleId="CharTok">
     <w:name w:val="CharTok"/>
     <w:basedOn w:val="VerbatimChar"/>
     <w:rPr>
-      <w:color w:val="4e9a06"/>
-      <w:shd w:val="clear" w:fill="f8f8f8"/>
+      <w:color w:val="4070a0"/>
     </w:rPr>
   </w:style>
   <w:style w:type="character" w:customStyle="1" w:styleId="SpecialCharTok">
     <w:name w:val="SpecialCharTok"/>
     <w:basedOn w:val="VerbatimChar"/>
     <w:rPr>
-      <w:b/>
-      <w:color w:val="ce5c00"/>
-      <w:shd w:val="clear" w:fill="f8f8f8"/>
+      <w:color w:val="4070a0"/>
     </w:rPr>
   </w:style>
   <w:style w:type="character" w:customStyle="1" w:styleId="StringTok">
     <w:name w:val="StringTok"/>
     <w:basedOn w:val="VerbatimChar"/>
     <w:rPr>
-      <w:color w:val="4e9a06"/>
-      <w:shd w:val="clear" w:fill="f8f8f8"/>
+      <w:color w:val="4070a0"/>
     </w:rPr>
   </w:style>
   <w:style w:type="character" w:customStyle="1" w:styleId="VerbatimStringTok">
     <w:name w:val="VerbatimStringTok"/>
     <w:basedOn w:val="VerbatimChar"/>
     <w:rPr>
-      <w:color w:val="4e9a06"/>
-      <w:shd w:val="clear" w:fill="f8f8f8"/>
+      <w:color w:val="4070a0"/>
     </w:rPr>
   </w:style>
   <w:style w:type="character" w:customStyle="1" w:styleId="SpecialStringTok">
     <w:name w:val="SpecialStringTok"/>
     <w:basedOn w:val="VerbatimChar"/>
     <w:rPr>
-      <w:color w:val="4e9a06"/>
-      <w:shd w:val="clear" w:fill="f8f8f8"/>
+      <w:color w:val="bb6688"/>
     </w:rPr>
   </w:style>
   <w:style w:type="character" w:customStyle="1" w:styleId="ImportTok">
     <w:name w:val="ImportTok"/>
     <w:basedOn w:val="VerbatimChar"/>
     <w:rPr>
-      <w:shd w:val="clear" w:fill="f8f8f8"/>
+      <w:b/>
+      <w:color w:val="008000"/>
     </w:rPr>
   </w:style>
   <w:style w:type="character" w:customStyle="1" w:styleId="CommentTok">
@@ -3086,18 +3087,15 @@
     <w:basedOn w:val="VerbatimChar"/>
     <w:rPr>
       <w:i/>
-      <w:color w:val="8f5902"/>
-      <w:shd w:val="clear" w:fill="f8f8f8"/>
+      <w:color w:val="60a0b0"/>
     </w:rPr>
   </w:style>
   <w:style w:type="character" w:customStyle="1" w:styleId="DocumentationTok">
     <w:name w:val="DocumentationTok"/>
     <w:basedOn w:val="VerbatimChar"/>
     <w:rPr>
-      <w:b/>
       <w:i/>
-      <w:color w:val="8f5902"/>
-      <w:shd w:val="clear" w:fill="f8f8f8"/>
+      <w:color w:val="ba2121"/>
     </w:rPr>
   </w:style>
   <w:style w:type="character" w:customStyle="1" w:styleId="AnnotationTok">
@@ -3106,8 +3104,7 @@
     <w:rPr>
       <w:b/>
       <w:i/>
-      <w:color w:val="8f5902"/>
-      <w:shd w:val="clear" w:fill="f8f8f8"/>
+      <w:color w:val="60a0b0"/>
     </w:rPr>
   </w:style>
   <w:style w:type="character" w:customStyle="1" w:styleId="CommentVarTok">
@@ -3116,33 +3113,28 @@
     <w:rPr>
       <w:b/>
       <w:i/>
-      <w:color w:val="8f5902"/>
-      <w:shd w:val="clear" w:fill="f8f8f8"/>
+      <w:color w:val="60a0b0"/>
     </w:rPr>
   </w:style>
   <w:style w:type="character" w:customStyle="1" w:styleId="OtherTok">
     <w:name w:val="OtherTok"/>
     <w:basedOn w:val="VerbatimChar"/>
     <w:rPr>
-      <w:color w:val="8f5902"/>
-      <w:shd w:val="clear" w:fill="f8f8f8"/>
+      <w:color w:val="007020"/>
     </w:rPr>
   </w:style>
   <w:style w:type="character" w:customStyle="1" w:styleId="FunctionTok">
     <w:name w:val="FunctionTok"/>
     <w:basedOn w:val="VerbatimChar"/>
     <w:rPr>
-      <w:b/>
-      <w:color w:val="204a87"/>
-      <w:shd w:val="clear" w:fill="f8f8f8"/>
+      <w:color w:val="06287e"/>
     </w:rPr>
   </w:style>
   <w:style w:type="character" w:customStyle="1" w:styleId="VariableTok">
     <w:name w:val="VariableTok"/>
     <w:basedOn w:val="VerbatimChar"/>
     <w:rPr>
-      <w:color w:val="000000"/>
-      <w:shd w:val="clear" w:fill="f8f8f8"/>
+      <w:color w:val="19177c"/>
     </w:rPr>
   </w:style>
   <w:style w:type="character" w:customStyle="1" w:styleId="ControlFlowTok">
@@ -3150,56 +3142,46 @@
     <w:basedOn w:val="VerbatimChar"/>
     <w:rPr>
       <w:b/>
-      <w:color w:val="204a87"/>
-      <w:shd w:val="clear" w:fill="f8f8f8"/>
+      <w:color w:val="007020"/>
     </w:rPr>
   </w:style>
   <w:style w:type="character" w:customStyle="1" w:styleId="OperatorTok">
     <w:name w:val="OperatorTok"/>
     <w:basedOn w:val="VerbatimChar"/>
     <w:rPr>
-      <w:b/>
-      <w:color w:val="ce5c00"/>
-      <w:shd w:val="clear" w:fill="f8f8f8"/>
+      <w:color w:val="666666"/>
     </w:rPr>
   </w:style>
   <w:style w:type="character" w:customStyle="1" w:styleId="BuiltInTok">
     <w:name w:val="BuiltInTok"/>
     <w:basedOn w:val="VerbatimChar"/>
     <w:rPr>
-      <w:shd w:val="clear" w:fill="f8f8f8"/>
+      <w:color w:val="008000"/>
     </w:rPr>
   </w:style>
   <w:style w:type="character" w:customStyle="1" w:styleId="ExtensionTok">
     <w:name w:val="ExtensionTok"/>
     <w:basedOn w:val="VerbatimChar"/>
-    <w:rPr>
-      <w:shd w:val="clear" w:fill="f8f8f8"/>
-    </w:rPr>
+    <w:rPr/>
   </w:style>
   <w:style w:type="character" w:customStyle="1" w:styleId="PreprocessorTok">
     <w:name w:val="PreprocessorTok"/>
     <w:basedOn w:val="VerbatimChar"/>
     <w:rPr>
-      <w:i/>
-      <w:color w:val="8f5902"/>
-      <w:shd w:val="clear" w:fill="f8f8f8"/>
+      <w:color w:val="bc7a00"/>
     </w:rPr>
   </w:style>
   <w:style w:type="character" w:customStyle="1" w:styleId="AttributeTok">
     <w:name w:val="AttributeTok"/>
     <w:basedOn w:val="VerbatimChar"/>
     <w:rPr>
-      <w:color w:val="204a87"/>
-      <w:shd w:val="clear" w:fill="f8f8f8"/>
+      <w:color w:val="7d9029"/>
     </w:rPr>
   </w:style>
   <w:style w:type="character" w:customStyle="1" w:styleId="RegionMarkerTok">
     <w:name w:val="RegionMarkerTok"/>
     <w:basedOn w:val="VerbatimChar"/>
-    <w:rPr>
-      <w:shd w:val="clear" w:fill="f8f8f8"/>
-    </w:rPr>
+    <w:rPr/>
   </w:style>
   <w:style w:type="character" w:customStyle="1" w:styleId="InformationTok">
     <w:name w:val="InformationTok"/>
@@ -3207,8 +3189,7 @@
     <w:rPr>
       <w:b/>
       <w:i/>
-      <w:color w:val="8f5902"/>
-      <w:shd w:val="clear" w:fill="f8f8f8"/>
+      <w:color w:val="60a0b0"/>
     </w:rPr>
   </w:style>
   <w:style w:type="character" w:customStyle="1" w:styleId="WarningTok">
@@ -3217,16 +3198,15 @@
     <w:rPr>
       <w:b/>
       <w:i/>
-      <w:color w:val="8f5902"/>
-      <w:shd w:val="clear" w:fill="f8f8f8"/>
+      <w:color w:val="60a0b0"/>
     </w:rPr>
   </w:style>
   <w:style w:type="character" w:customStyle="1" w:styleId="AlertTok">
     <w:name w:val="AlertTok"/>
     <w:basedOn w:val="VerbatimChar"/>
     <w:rPr>
-      <w:color w:val="ef2929"/>
-      <w:shd w:val="clear" w:fill="f8f8f8"/>
+      <w:b/>
+      <w:color w:val="ff0000"/>
     </w:rPr>
   </w:style>
   <w:style w:type="character" w:customStyle="1" w:styleId="ErrorTok">
@@ -3234,16 +3214,13 @@
     <w:basedOn w:val="VerbatimChar"/>
     <w:rPr>
       <w:b/>
-      <w:color w:val="a40000"/>
-      <w:shd w:val="clear" w:fill="f8f8f8"/>
+      <w:color w:val="ff0000"/>
     </w:rPr>
   </w:style>
   <w:style w:type="character" w:customStyle="1" w:styleId="NormalTok">
     <w:name w:val="NormalTok"/>
     <w:basedOn w:val="VerbatimChar"/>
-    <w:rPr>
-      <w:shd w:val="clear" w:fill="f8f8f8"/>
-    </w:rPr>
+    <w:rPr/>
   </w:style>
 </w:styles>
 </file>

</xml_diff>